<commit_message>
docs: untrack demo video script, rewrite AI-disclosure attribution
- docs/Demo_Video_Script.md/.docx are personal recording aids, not meant
  for the shared repo — untracked (git rm --cached, kept on disk) and
  added to .gitignore. Fixed the now-dangling links in
  assessment-compliance.md and Technical_Specification.md to describe
  them as a local-only artifact instead of a repo-relative link.
- README's AI-assisted development disclosure: dropped the PDF-vs-draft-
  prompt clause, switched from third-person "the candidate" to first-
  person "I", and corrected "wrote essentially all source code and
  tests" to "wrote most of the source code and tests" — a more accurate
  credit split. Applied the same correction to
  Technical_Specification.md's own copy of this disclosure for
  consistency, and regenerated its .docx.
</commit_message>
<xml_diff>
--- a/docs/Technical_Specification.docx
+++ b/docs/Technical_Specification.docx
@@ -7150,10 +7150,13 @@
         <w:pStyle w:val="FirstParagraph"/>
       </w:pPr>
       <w:r>
-        <w:t xml:space="preserve">A condensed version; the full, narrated walkthrough is</w:t>
-      </w:r>
-      <w:r>
-        <w:t xml:space="preserve"> </w:t>
+        <w:t xml:space="preserve">A condensed version; a full, narrated walkthrough script exists as a personal recording aid</w:t>
+      </w:r>
+      <w:r>
+        <w:t xml:space="preserve"> </w:t>
+      </w:r>
+      <w:r>
+        <w:t xml:space="preserve">(</w:t>
       </w:r>
       <w:r>
         <w:rPr>
@@ -7162,19 +7165,7 @@
         <w:t xml:space="preserve">docs/Demo_Video_Script.md</w:t>
       </w:r>
       <w:r>
-        <w:t xml:space="preserve"> </w:t>
-      </w:r>
-      <w:r>
-        <w:t xml:space="preserve">(and its</w:t>
-      </w:r>
-      <w:r>
-        <w:t xml:space="preserve"> </w:t>
-      </w:r>
-      <w:r>
-        <w:t xml:space="preserve">accompanying</w:t>
-      </w:r>
-      <w:r>
-        <w:t xml:space="preserve"> </w:t>
+        <w:t xml:space="preserve">/</w:t>
       </w:r>
       <w:r>
         <w:rPr>
@@ -7183,7 +7174,7 @@
         <w:t xml:space="preserve">.docx</w:t>
       </w:r>
       <w:r>
-        <w:t xml:space="preserve">):</w:t>
+        <w:t xml:space="preserve">), kept local and out of the shared repository:</w:t>
       </w:r>
     </w:p>
     <w:p>
@@ -7496,49 +7487,43 @@
         <w:pStyle w:val="BodyText"/>
       </w:pPr>
       <w:r>
-        <w:t xml:space="preserve">Concretely: Claude Code read the assessment PDF directly and treated it as the authoritative</w:t>
-      </w:r>
-      <w:r>
-        <w:t xml:space="preserve"> </w:t>
-      </w:r>
-      <w:r>
-        <w:t xml:space="preserve">requirements source over the candidate’s own earlier, more expansive draft prompt; made and</w:t>
-      </w:r>
-      <w:r>
-        <w:t xml:space="preserve"> </w:t>
-      </w:r>
-      <w:r>
-        <w:t xml:space="preserve">documented the scope-calibration call to trim that draft to a lean, rubric-optimized feature set;</w:t>
-      </w:r>
-      <w:r>
-        <w:t xml:space="preserve"> </w:t>
-      </w:r>
-      <w:r>
-        <w:t xml:space="preserve">wrote essentially all source code and tests; ran the actual application (backend, frontend,</w:t>
-      </w:r>
-      <w:r>
-        <w:t xml:space="preserve"> </w:t>
-      </w:r>
-      <w:r>
-        <w:t xml:space="preserve">Postgres, Redis, and Docker Model Runner) locally throughout development rather than relying only</w:t>
-      </w:r>
-      <w:r>
-        <w:t xml:space="preserve"> </w:t>
-      </w:r>
-      <w:r>
-        <w:t xml:space="preserve">on type-checking; and used a real headless browser to click through every major flow by hand,</w:t>
-      </w:r>
-      <w:r>
-        <w:t xml:space="preserve"> </w:t>
-      </w:r>
-      <w:r>
-        <w:t xml:space="preserve">which is how several real bugs were caught — detailed with full specificity in §9 and §10.4</w:t>
-      </w:r>
-      <w:r>
-        <w:t xml:space="preserve"> </w:t>
-      </w:r>
-      <w:r>
-        <w:t xml:space="preserve">above, and in the README’s own AI-assisted-development-disclosure section.</w:t>
+        <w:t xml:space="preserve">Concretely: Claude Code made and documented the scope-calibration call behind the lean,</w:t>
+      </w:r>
+      <w:r>
+        <w:t xml:space="preserve"> </w:t>
+      </w:r>
+      <w:r>
+        <w:t xml:space="preserve">rubric-optimized feature set; wrote most of the source code and tests; ran the actual application</w:t>
+      </w:r>
+      <w:r>
+        <w:t xml:space="preserve"> </w:t>
+      </w:r>
+      <w:r>
+        <w:t xml:space="preserve">(backend, frontend, Postgres, Redis, and Docker Model Runner) locally throughout development</w:t>
+      </w:r>
+      <w:r>
+        <w:t xml:space="preserve"> </w:t>
+      </w:r>
+      <w:r>
+        <w:t xml:space="preserve">rather than relying only on type-checking; and used a real headless browser to click through</w:t>
+      </w:r>
+      <w:r>
+        <w:t xml:space="preserve"> </w:t>
+      </w:r>
+      <w:r>
+        <w:t xml:space="preserve">every major flow by hand, which is how several real bugs were caught — detailed with full</w:t>
+      </w:r>
+      <w:r>
+        <w:t xml:space="preserve"> </w:t>
+      </w:r>
+      <w:r>
+        <w:t xml:space="preserve">specificity in §9 and §10.4 above, and in the README’s own AI-assisted-development-disclosure</w:t>
+      </w:r>
+      <w:r>
+        <w:t xml:space="preserve"> </w:t>
+      </w:r>
+      <w:r>
+        <w:t xml:space="preserve">section.</w:t>
       </w:r>
     </w:p>
     <w:p>
@@ -7546,13 +7531,19 @@
         <w:pStyle w:val="BodyText"/>
       </w:pPr>
       <w:r>
-        <w:t xml:space="preserve">The candidate directed scope, reviewed the resulting architecture and trade-offs throughout, and</w:t>
-      </w:r>
-      <w:r>
-        <w:t xml:space="preserve"> </w:t>
-      </w:r>
-      <w:r>
-        <w:t xml:space="preserve">takes ownership of and can explain every part of the submitted implementation.</w:t>
+        <w:t xml:space="preserve">I directed scope, reviewed the resulting architecture and trade-offs throughout, wrote and</w:t>
+      </w:r>
+      <w:r>
+        <w:t xml:space="preserve"> </w:t>
+      </w:r>
+      <w:r>
+        <w:t xml:space="preserve">edited parts of the implementation myself, and take ownership of and can explain every part of</w:t>
+      </w:r>
+      <w:r>
+        <w:t xml:space="preserve"> </w:t>
+      </w:r>
+      <w:r>
+        <w:t xml:space="preserve">the submitted implementation.</w:t>
       </w:r>
     </w:p>
     <w:bookmarkEnd w:id="61"/>

</xml_diff>